<commit_message>
get method input id
</commit_message>
<xml_diff>
--- a/Fast_api_doc.docx
+++ b/Fast_api_doc.docx
@@ -40,6 +40,22 @@
           <w:sz w:val="28"/>
         </w:rPr>
         <w:t>uvicorn</w:t>
+      </w:r>
+      <w:proofErr w:type="spellEnd"/>
+      <w:r>
+        <w:rPr>
+          <w:rFonts w:ascii="Poppins" w:hAnsi="Poppins" w:cs="Poppins"/>
+          <w:sz w:val="28"/>
+        </w:rPr>
+        <w:t xml:space="preserve"> </w:t>
+      </w:r>
+      <w:proofErr w:type="spellStart"/>
+      <w:r>
+        <w:rPr>
+          <w:rFonts w:ascii="Poppins" w:hAnsi="Poppins" w:cs="Poppins"/>
+          <w:sz w:val="28"/>
+        </w:rPr>
+        <w:t>pyd</w:t>
       </w:r>
       <w:proofErr w:type="spellEnd"/>
     </w:p>
@@ -97,7 +113,21 @@
           <w:rFonts w:ascii="Poppins" w:hAnsi="Poppins" w:cs="Poppins"/>
           <w:sz w:val="28"/>
         </w:rPr>
-        <w:t xml:space="preserve"> –reload`</w:t>
+        <w:t xml:space="preserve"> –</w:t>
+      </w:r>
+      <w:r>
+        <w:rPr>
+          <w:rFonts w:ascii="Poppins" w:hAnsi="Poppins" w:cs="Poppins"/>
+          <w:sz w:val="28"/>
+        </w:rPr>
+        <w:t>-</w:t>
+      </w:r>
+      <w:r>
+        <w:rPr>
+          <w:rFonts w:ascii="Poppins" w:hAnsi="Poppins" w:cs="Poppins"/>
+          <w:sz w:val="28"/>
+        </w:rPr>
+        <w:t>reload`</w:t>
       </w:r>
     </w:p>
     <w:p>
@@ -108,8 +138,1531 @@
           <w:sz w:val="28"/>
         </w:rPr>
       </w:pPr>
-      <w:bookmarkStart w:id="0" w:name="_GoBack"/>
-      <w:bookmarkEnd w:id="0"/>
+    </w:p>
+    <w:tbl>
+      <w:tblPr>
+        <w:tblStyle w:val="TableGrid"/>
+        <w:tblW w:w="0" w:type="auto"/>
+        <w:tblLook w:val="04A0" w:firstRow="1" w:lastRow="0" w:firstColumn="1" w:lastColumn="0" w:noHBand="0" w:noVBand="1"/>
+      </w:tblPr>
+      <w:tblGrid>
+        <w:gridCol w:w="9350"/>
+      </w:tblGrid>
+      <w:tr>
+        <w:tc>
+          <w:tcPr>
+            <w:tcW w:w="9350" w:type="dxa"/>
+          </w:tcPr>
+          <w:p>
+            <w:pPr>
+              <w:shd w:val="clear" w:color="auto" w:fill="1F1F1F"/>
+              <w:spacing w:line="285" w:lineRule="atLeast"/>
+              <w:rPr>
+                <w:rFonts w:ascii="Consolas" w:eastAsia="Times New Roman" w:hAnsi="Consolas" w:cs="Times New Roman"/>
+                <w:color w:val="CCCCCC"/>
+                <w:sz w:val="21"/>
+                <w:szCs w:val="21"/>
+              </w:rPr>
+            </w:pPr>
+            <w:r>
+              <w:rPr>
+                <w:rFonts w:ascii="Consolas" w:eastAsia="Times New Roman" w:hAnsi="Consolas" w:cs="Times New Roman"/>
+                <w:color w:val="C586C0"/>
+                <w:sz w:val="21"/>
+                <w:szCs w:val="21"/>
+              </w:rPr>
+              <w:t>from</w:t>
+            </w:r>
+            <w:r>
+              <w:rPr>
+                <w:rFonts w:ascii="Consolas" w:eastAsia="Times New Roman" w:hAnsi="Consolas" w:cs="Times New Roman"/>
+                <w:color w:val="CCCCCC"/>
+                <w:sz w:val="21"/>
+                <w:szCs w:val="21"/>
+              </w:rPr>
+              <w:t xml:space="preserve"> </w:t>
+            </w:r>
+            <w:proofErr w:type="spellStart"/>
+            <w:r>
+              <w:rPr>
+                <w:rFonts w:ascii="Consolas" w:eastAsia="Times New Roman" w:hAnsi="Consolas" w:cs="Times New Roman"/>
+                <w:color w:val="4EC9B0"/>
+                <w:sz w:val="21"/>
+                <w:szCs w:val="21"/>
+              </w:rPr>
+              <w:t>fastapi</w:t>
+            </w:r>
+            <w:proofErr w:type="spellEnd"/>
+            <w:r>
+              <w:rPr>
+                <w:rFonts w:ascii="Consolas" w:eastAsia="Times New Roman" w:hAnsi="Consolas" w:cs="Times New Roman"/>
+                <w:color w:val="CCCCCC"/>
+                <w:sz w:val="21"/>
+                <w:szCs w:val="21"/>
+              </w:rPr>
+              <w:t xml:space="preserve"> </w:t>
+            </w:r>
+            <w:r>
+              <w:rPr>
+                <w:rFonts w:ascii="Consolas" w:eastAsia="Times New Roman" w:hAnsi="Consolas" w:cs="Times New Roman"/>
+                <w:color w:val="C586C0"/>
+                <w:sz w:val="21"/>
+                <w:szCs w:val="21"/>
+              </w:rPr>
+              <w:t>import</w:t>
+            </w:r>
+            <w:r>
+              <w:rPr>
+                <w:rFonts w:ascii="Consolas" w:eastAsia="Times New Roman" w:hAnsi="Consolas" w:cs="Times New Roman"/>
+                <w:color w:val="CCCCCC"/>
+                <w:sz w:val="21"/>
+                <w:szCs w:val="21"/>
+              </w:rPr>
+              <w:t xml:space="preserve"> </w:t>
+            </w:r>
+            <w:proofErr w:type="spellStart"/>
+            <w:r>
+              <w:rPr>
+                <w:rFonts w:ascii="Consolas" w:eastAsia="Times New Roman" w:hAnsi="Consolas" w:cs="Times New Roman"/>
+                <w:color w:val="4EC9B0"/>
+                <w:sz w:val="21"/>
+                <w:szCs w:val="21"/>
+              </w:rPr>
+              <w:t>FastAPI</w:t>
+            </w:r>
+            <w:proofErr w:type="spellEnd"/>
+          </w:p>
+          <w:p>
+            <w:pPr>
+              <w:shd w:val="clear" w:color="auto" w:fill="1F1F1F"/>
+              <w:spacing w:line="285" w:lineRule="atLeast"/>
+              <w:rPr>
+                <w:rFonts w:ascii="Consolas" w:eastAsia="Times New Roman" w:hAnsi="Consolas" w:cs="Times New Roman"/>
+                <w:color w:val="CCCCCC"/>
+                <w:sz w:val="21"/>
+                <w:szCs w:val="21"/>
+              </w:rPr>
+            </w:pPr>
+            <w:r>
+              <w:rPr>
+                <w:rFonts w:ascii="Consolas" w:eastAsia="Times New Roman" w:hAnsi="Consolas" w:cs="Times New Roman"/>
+                <w:color w:val="C586C0"/>
+                <w:sz w:val="21"/>
+                <w:szCs w:val="21"/>
+              </w:rPr>
+              <w:t>import</w:t>
+            </w:r>
+            <w:r>
+              <w:rPr>
+                <w:rFonts w:ascii="Consolas" w:eastAsia="Times New Roman" w:hAnsi="Consolas" w:cs="Times New Roman"/>
+                <w:color w:val="CCCCCC"/>
+                <w:sz w:val="21"/>
+                <w:szCs w:val="21"/>
+              </w:rPr>
+              <w:t xml:space="preserve"> </w:t>
+            </w:r>
+            <w:r>
+              <w:rPr>
+                <w:rFonts w:ascii="Consolas" w:eastAsia="Times New Roman" w:hAnsi="Consolas" w:cs="Times New Roman"/>
+                <w:color w:val="4EC9B0"/>
+                <w:sz w:val="21"/>
+                <w:szCs w:val="21"/>
+              </w:rPr>
+              <w:t>json</w:t>
+            </w:r>
+          </w:p>
+          <w:p>
+            <w:pPr>
+              <w:shd w:val="clear" w:color="auto" w:fill="1F1F1F"/>
+              <w:spacing w:line="285" w:lineRule="atLeast"/>
+              <w:rPr>
+                <w:rFonts w:ascii="Consolas" w:eastAsia="Times New Roman" w:hAnsi="Consolas" w:cs="Times New Roman"/>
+                <w:color w:val="CCCCCC"/>
+                <w:sz w:val="21"/>
+                <w:szCs w:val="21"/>
+              </w:rPr>
+            </w:pPr>
+          </w:p>
+          <w:p>
+            <w:pPr>
+              <w:shd w:val="clear" w:color="auto" w:fill="1F1F1F"/>
+              <w:spacing w:line="285" w:lineRule="atLeast"/>
+              <w:rPr>
+                <w:rFonts w:ascii="Consolas" w:eastAsia="Times New Roman" w:hAnsi="Consolas" w:cs="Times New Roman"/>
+                <w:color w:val="CCCCCC"/>
+                <w:sz w:val="21"/>
+                <w:szCs w:val="21"/>
+              </w:rPr>
+            </w:pPr>
+            <w:r>
+              <w:rPr>
+                <w:rFonts w:ascii="Consolas" w:eastAsia="Times New Roman" w:hAnsi="Consolas" w:cs="Times New Roman"/>
+                <w:color w:val="9CDCFE"/>
+                <w:sz w:val="21"/>
+                <w:szCs w:val="21"/>
+              </w:rPr>
+              <w:t>app</w:t>
+            </w:r>
+            <w:r>
+              <w:rPr>
+                <w:rFonts w:ascii="Consolas" w:eastAsia="Times New Roman" w:hAnsi="Consolas" w:cs="Times New Roman"/>
+                <w:color w:val="CCCCCC"/>
+                <w:sz w:val="21"/>
+                <w:szCs w:val="21"/>
+              </w:rPr>
+              <w:t xml:space="preserve"> </w:t>
+            </w:r>
+            <w:r>
+              <w:rPr>
+                <w:rFonts w:ascii="Consolas" w:eastAsia="Times New Roman" w:hAnsi="Consolas" w:cs="Times New Roman"/>
+                <w:color w:val="D4D4D4"/>
+                <w:sz w:val="21"/>
+                <w:szCs w:val="21"/>
+              </w:rPr>
+              <w:t>=</w:t>
+            </w:r>
+            <w:r>
+              <w:rPr>
+                <w:rFonts w:ascii="Consolas" w:eastAsia="Times New Roman" w:hAnsi="Consolas" w:cs="Times New Roman"/>
+                <w:color w:val="CCCCCC"/>
+                <w:sz w:val="21"/>
+                <w:szCs w:val="21"/>
+              </w:rPr>
+              <w:t xml:space="preserve"> </w:t>
+            </w:r>
+            <w:proofErr w:type="spellStart"/>
+            <w:proofErr w:type="gramStart"/>
+            <w:r>
+              <w:rPr>
+                <w:rFonts w:ascii="Consolas" w:eastAsia="Times New Roman" w:hAnsi="Consolas" w:cs="Times New Roman"/>
+                <w:color w:val="4EC9B0"/>
+                <w:sz w:val="21"/>
+                <w:szCs w:val="21"/>
+              </w:rPr>
+              <w:t>FastAPI</w:t>
+            </w:r>
+            <w:proofErr w:type="spellEnd"/>
+            <w:r>
+              <w:rPr>
+                <w:rFonts w:ascii="Consolas" w:eastAsia="Times New Roman" w:hAnsi="Consolas" w:cs="Times New Roman"/>
+                <w:color w:val="CCCCCC"/>
+                <w:sz w:val="21"/>
+                <w:szCs w:val="21"/>
+              </w:rPr>
+              <w:t>(</w:t>
+            </w:r>
+            <w:proofErr w:type="gramEnd"/>
+            <w:r>
+              <w:rPr>
+                <w:rFonts w:ascii="Consolas" w:eastAsia="Times New Roman" w:hAnsi="Consolas" w:cs="Times New Roman"/>
+                <w:color w:val="CCCCCC"/>
+                <w:sz w:val="21"/>
+                <w:szCs w:val="21"/>
+              </w:rPr>
+              <w:t>)</w:t>
+            </w:r>
+          </w:p>
+          <w:p>
+            <w:pPr>
+              <w:shd w:val="clear" w:color="auto" w:fill="1F1F1F"/>
+              <w:spacing w:line="285" w:lineRule="atLeast"/>
+              <w:rPr>
+                <w:rFonts w:ascii="Consolas" w:eastAsia="Times New Roman" w:hAnsi="Consolas" w:cs="Times New Roman"/>
+                <w:color w:val="CCCCCC"/>
+                <w:sz w:val="21"/>
+                <w:szCs w:val="21"/>
+              </w:rPr>
+            </w:pPr>
+          </w:p>
+          <w:p>
+            <w:pPr>
+              <w:shd w:val="clear" w:color="auto" w:fill="1F1F1F"/>
+              <w:spacing w:line="285" w:lineRule="atLeast"/>
+              <w:rPr>
+                <w:rFonts w:ascii="Consolas" w:eastAsia="Times New Roman" w:hAnsi="Consolas" w:cs="Times New Roman"/>
+                <w:color w:val="CCCCCC"/>
+                <w:sz w:val="21"/>
+                <w:szCs w:val="21"/>
+              </w:rPr>
+            </w:pPr>
+            <w:r>
+              <w:rPr>
+                <w:rFonts w:ascii="Consolas" w:eastAsia="Times New Roman" w:hAnsi="Consolas" w:cs="Times New Roman"/>
+                <w:color w:val="DCDCAA"/>
+                <w:sz w:val="21"/>
+                <w:szCs w:val="21"/>
+              </w:rPr>
+              <w:t>@</w:t>
+            </w:r>
+            <w:proofErr w:type="spellStart"/>
+            <w:proofErr w:type="gramStart"/>
+            <w:r>
+              <w:rPr>
+                <w:rFonts w:ascii="Consolas" w:eastAsia="Times New Roman" w:hAnsi="Consolas" w:cs="Times New Roman"/>
+                <w:color w:val="9CDCFE"/>
+                <w:sz w:val="21"/>
+                <w:szCs w:val="21"/>
+              </w:rPr>
+              <w:t>app</w:t>
+            </w:r>
+            <w:r>
+              <w:rPr>
+                <w:rFonts w:ascii="Consolas" w:eastAsia="Times New Roman" w:hAnsi="Consolas" w:cs="Times New Roman"/>
+                <w:color w:val="DCDCAA"/>
+                <w:sz w:val="21"/>
+                <w:szCs w:val="21"/>
+              </w:rPr>
+              <w:t>.get</w:t>
+            </w:r>
+            <w:proofErr w:type="spellEnd"/>
+            <w:r>
+              <w:rPr>
+                <w:rFonts w:ascii="Consolas" w:eastAsia="Times New Roman" w:hAnsi="Consolas" w:cs="Times New Roman"/>
+                <w:color w:val="CCCCCC"/>
+                <w:sz w:val="21"/>
+                <w:szCs w:val="21"/>
+              </w:rPr>
+              <w:t>(</w:t>
+            </w:r>
+            <w:proofErr w:type="gramEnd"/>
+            <w:r>
+              <w:rPr>
+                <w:rFonts w:ascii="Consolas" w:eastAsia="Times New Roman" w:hAnsi="Consolas" w:cs="Times New Roman"/>
+                <w:color w:val="CE9178"/>
+                <w:sz w:val="21"/>
+                <w:szCs w:val="21"/>
+              </w:rPr>
+              <w:t>"/"</w:t>
+            </w:r>
+            <w:r>
+              <w:rPr>
+                <w:rFonts w:ascii="Consolas" w:eastAsia="Times New Roman" w:hAnsi="Consolas" w:cs="Times New Roman"/>
+                <w:color w:val="CCCCCC"/>
+                <w:sz w:val="21"/>
+                <w:szCs w:val="21"/>
+              </w:rPr>
+              <w:t>)</w:t>
+            </w:r>
+          </w:p>
+          <w:p>
+            <w:pPr>
+              <w:shd w:val="clear" w:color="auto" w:fill="1F1F1F"/>
+              <w:spacing w:line="285" w:lineRule="atLeast"/>
+              <w:rPr>
+                <w:rFonts w:ascii="Consolas" w:eastAsia="Times New Roman" w:hAnsi="Consolas" w:cs="Times New Roman"/>
+                <w:color w:val="CCCCCC"/>
+                <w:sz w:val="21"/>
+                <w:szCs w:val="21"/>
+              </w:rPr>
+            </w:pPr>
+            <w:r>
+              <w:rPr>
+                <w:rFonts w:ascii="Consolas" w:eastAsia="Times New Roman" w:hAnsi="Consolas" w:cs="Times New Roman"/>
+                <w:color w:val="569CD6"/>
+                <w:sz w:val="21"/>
+                <w:szCs w:val="21"/>
+              </w:rPr>
+              <w:t>def</w:t>
+            </w:r>
+            <w:r>
+              <w:rPr>
+                <w:rFonts w:ascii="Consolas" w:eastAsia="Times New Roman" w:hAnsi="Consolas" w:cs="Times New Roman"/>
+                <w:color w:val="CCCCCC"/>
+                <w:sz w:val="21"/>
+                <w:szCs w:val="21"/>
+              </w:rPr>
+              <w:t xml:space="preserve"> </w:t>
+            </w:r>
+            <w:proofErr w:type="gramStart"/>
+            <w:r>
+              <w:rPr>
+                <w:rFonts w:ascii="Consolas" w:eastAsia="Times New Roman" w:hAnsi="Consolas" w:cs="Times New Roman"/>
+                <w:color w:val="DCDCAA"/>
+                <w:sz w:val="21"/>
+                <w:szCs w:val="21"/>
+              </w:rPr>
+              <w:t>hello</w:t>
+            </w:r>
+            <w:r>
+              <w:rPr>
+                <w:rFonts w:ascii="Consolas" w:eastAsia="Times New Roman" w:hAnsi="Consolas" w:cs="Times New Roman"/>
+                <w:color w:val="CCCCCC"/>
+                <w:sz w:val="21"/>
+                <w:szCs w:val="21"/>
+              </w:rPr>
+              <w:t>(</w:t>
+            </w:r>
+            <w:proofErr w:type="gramEnd"/>
+            <w:r>
+              <w:rPr>
+                <w:rFonts w:ascii="Consolas" w:eastAsia="Times New Roman" w:hAnsi="Consolas" w:cs="Times New Roman"/>
+                <w:color w:val="CCCCCC"/>
+                <w:sz w:val="21"/>
+                <w:szCs w:val="21"/>
+              </w:rPr>
+              <w:t>):</w:t>
+            </w:r>
+          </w:p>
+          <w:p>
+            <w:pPr>
+              <w:shd w:val="clear" w:color="auto" w:fill="1F1F1F"/>
+              <w:spacing w:line="285" w:lineRule="atLeast"/>
+              <w:rPr>
+                <w:rFonts w:ascii="Consolas" w:eastAsia="Times New Roman" w:hAnsi="Consolas" w:cs="Times New Roman"/>
+                <w:color w:val="CCCCCC"/>
+                <w:sz w:val="21"/>
+                <w:szCs w:val="21"/>
+              </w:rPr>
+            </w:pPr>
+            <w:r>
+              <w:rPr>
+                <w:rFonts w:ascii="Consolas" w:eastAsia="Times New Roman" w:hAnsi="Consolas" w:cs="Times New Roman"/>
+                <w:color w:val="CCCCCC"/>
+                <w:sz w:val="21"/>
+                <w:szCs w:val="21"/>
+              </w:rPr>
+              <w:t xml:space="preserve">    </w:t>
+            </w:r>
+            <w:r>
+              <w:rPr>
+                <w:rFonts w:ascii="Consolas" w:eastAsia="Times New Roman" w:hAnsi="Consolas" w:cs="Times New Roman"/>
+                <w:color w:val="C586C0"/>
+                <w:sz w:val="21"/>
+                <w:szCs w:val="21"/>
+              </w:rPr>
+              <w:t>return</w:t>
+            </w:r>
+            <w:r>
+              <w:rPr>
+                <w:rFonts w:ascii="Consolas" w:eastAsia="Times New Roman" w:hAnsi="Consolas" w:cs="Times New Roman"/>
+                <w:color w:val="CCCCCC"/>
+                <w:sz w:val="21"/>
+                <w:szCs w:val="21"/>
+              </w:rPr>
+              <w:t xml:space="preserve"> {</w:t>
+            </w:r>
+            <w:r>
+              <w:rPr>
+                <w:rFonts w:ascii="Consolas" w:eastAsia="Times New Roman" w:hAnsi="Consolas" w:cs="Times New Roman"/>
+                <w:color w:val="CE9178"/>
+                <w:sz w:val="21"/>
+                <w:szCs w:val="21"/>
+              </w:rPr>
+              <w:t>"message"</w:t>
+            </w:r>
+            <w:r>
+              <w:rPr>
+                <w:rFonts w:ascii="Consolas" w:eastAsia="Times New Roman" w:hAnsi="Consolas" w:cs="Times New Roman"/>
+                <w:color w:val="CCCCCC"/>
+                <w:sz w:val="21"/>
+                <w:szCs w:val="21"/>
+              </w:rPr>
+              <w:t xml:space="preserve">: </w:t>
+            </w:r>
+            <w:r>
+              <w:rPr>
+                <w:rFonts w:ascii="Consolas" w:eastAsia="Times New Roman" w:hAnsi="Consolas" w:cs="Times New Roman"/>
+                <w:color w:val="CE9178"/>
+                <w:sz w:val="21"/>
+                <w:szCs w:val="21"/>
+              </w:rPr>
+              <w:t>'Hello world'</w:t>
+            </w:r>
+            <w:r>
+              <w:rPr>
+                <w:rFonts w:ascii="Consolas" w:eastAsia="Times New Roman" w:hAnsi="Consolas" w:cs="Times New Roman"/>
+                <w:color w:val="CCCCCC"/>
+                <w:sz w:val="21"/>
+                <w:szCs w:val="21"/>
+              </w:rPr>
+              <w:t>}</w:t>
+            </w:r>
+          </w:p>
+          <w:p>
+            <w:pPr>
+              <w:shd w:val="clear" w:color="auto" w:fill="1F1F1F"/>
+              <w:spacing w:line="285" w:lineRule="atLeast"/>
+              <w:rPr>
+                <w:rFonts w:ascii="Consolas" w:eastAsia="Times New Roman" w:hAnsi="Consolas" w:cs="Times New Roman"/>
+                <w:color w:val="CCCCCC"/>
+                <w:sz w:val="21"/>
+                <w:szCs w:val="21"/>
+              </w:rPr>
+            </w:pPr>
+          </w:p>
+          <w:p>
+            <w:pPr>
+              <w:shd w:val="clear" w:color="auto" w:fill="1F1F1F"/>
+              <w:spacing w:line="285" w:lineRule="atLeast"/>
+              <w:rPr>
+                <w:rFonts w:ascii="Consolas" w:eastAsia="Times New Roman" w:hAnsi="Consolas" w:cs="Times New Roman"/>
+                <w:color w:val="CCCCCC"/>
+                <w:sz w:val="21"/>
+                <w:szCs w:val="21"/>
+              </w:rPr>
+            </w:pPr>
+            <w:r>
+              <w:rPr>
+                <w:rFonts w:ascii="Consolas" w:eastAsia="Times New Roman" w:hAnsi="Consolas" w:cs="Times New Roman"/>
+                <w:color w:val="DCDCAA"/>
+                <w:sz w:val="21"/>
+                <w:szCs w:val="21"/>
+              </w:rPr>
+              <w:t>@</w:t>
+            </w:r>
+            <w:proofErr w:type="spellStart"/>
+            <w:r>
+              <w:rPr>
+                <w:rFonts w:ascii="Consolas" w:eastAsia="Times New Roman" w:hAnsi="Consolas" w:cs="Times New Roman"/>
+                <w:color w:val="9CDCFE"/>
+                <w:sz w:val="21"/>
+                <w:szCs w:val="21"/>
+              </w:rPr>
+              <w:t>app</w:t>
+            </w:r>
+            <w:r>
+              <w:rPr>
+                <w:rFonts w:ascii="Consolas" w:eastAsia="Times New Roman" w:hAnsi="Consolas" w:cs="Times New Roman"/>
+                <w:color w:val="DCDCAA"/>
+                <w:sz w:val="21"/>
+                <w:szCs w:val="21"/>
+              </w:rPr>
+              <w:t>.get</w:t>
+            </w:r>
+            <w:proofErr w:type="spellEnd"/>
+            <w:r>
+              <w:rPr>
+                <w:rFonts w:ascii="Consolas" w:eastAsia="Times New Roman" w:hAnsi="Consolas" w:cs="Times New Roman"/>
+                <w:color w:val="CCCCCC"/>
+                <w:sz w:val="21"/>
+                <w:szCs w:val="21"/>
+              </w:rPr>
+              <w:t>(</w:t>
+            </w:r>
+            <w:r>
+              <w:rPr>
+                <w:rFonts w:ascii="Consolas" w:eastAsia="Times New Roman" w:hAnsi="Consolas" w:cs="Times New Roman"/>
+                <w:color w:val="CE9178"/>
+                <w:sz w:val="21"/>
+                <w:szCs w:val="21"/>
+              </w:rPr>
+              <w:t>'/about'</w:t>
+            </w:r>
+            <w:r>
+              <w:rPr>
+                <w:rFonts w:ascii="Consolas" w:eastAsia="Times New Roman" w:hAnsi="Consolas" w:cs="Times New Roman"/>
+                <w:color w:val="CCCCCC"/>
+                <w:sz w:val="21"/>
+                <w:szCs w:val="21"/>
+              </w:rPr>
+              <w:t>)</w:t>
+            </w:r>
+          </w:p>
+          <w:p>
+            <w:pPr>
+              <w:shd w:val="clear" w:color="auto" w:fill="1F1F1F"/>
+              <w:spacing w:line="285" w:lineRule="atLeast"/>
+              <w:rPr>
+                <w:rFonts w:ascii="Consolas" w:eastAsia="Times New Roman" w:hAnsi="Consolas" w:cs="Times New Roman"/>
+                <w:color w:val="CCCCCC"/>
+                <w:sz w:val="21"/>
+                <w:szCs w:val="21"/>
+              </w:rPr>
+            </w:pPr>
+            <w:r>
+              <w:rPr>
+                <w:rFonts w:ascii="Consolas" w:eastAsia="Times New Roman" w:hAnsi="Consolas" w:cs="Times New Roman"/>
+                <w:color w:val="569CD6"/>
+                <w:sz w:val="21"/>
+                <w:szCs w:val="21"/>
+              </w:rPr>
+              <w:t>def</w:t>
+            </w:r>
+            <w:r>
+              <w:rPr>
+                <w:rFonts w:ascii="Consolas" w:eastAsia="Times New Roman" w:hAnsi="Consolas" w:cs="Times New Roman"/>
+                <w:color w:val="CCCCCC"/>
+                <w:sz w:val="21"/>
+                <w:szCs w:val="21"/>
+              </w:rPr>
+              <w:t xml:space="preserve"> </w:t>
+            </w:r>
+            <w:proofErr w:type="gramStart"/>
+            <w:r>
+              <w:rPr>
+                <w:rFonts w:ascii="Consolas" w:eastAsia="Times New Roman" w:hAnsi="Consolas" w:cs="Times New Roman"/>
+                <w:color w:val="DCDCAA"/>
+                <w:sz w:val="21"/>
+                <w:szCs w:val="21"/>
+              </w:rPr>
+              <w:t>about</w:t>
+            </w:r>
+            <w:r>
+              <w:rPr>
+                <w:rFonts w:ascii="Consolas" w:eastAsia="Times New Roman" w:hAnsi="Consolas" w:cs="Times New Roman"/>
+                <w:color w:val="CCCCCC"/>
+                <w:sz w:val="21"/>
+                <w:szCs w:val="21"/>
+              </w:rPr>
+              <w:t>(</w:t>
+            </w:r>
+            <w:proofErr w:type="gramEnd"/>
+            <w:r>
+              <w:rPr>
+                <w:rFonts w:ascii="Consolas" w:eastAsia="Times New Roman" w:hAnsi="Consolas" w:cs="Times New Roman"/>
+                <w:color w:val="CCCCCC"/>
+                <w:sz w:val="21"/>
+                <w:szCs w:val="21"/>
+              </w:rPr>
+              <w:t>):</w:t>
+            </w:r>
+          </w:p>
+          <w:p>
+            <w:pPr>
+              <w:shd w:val="clear" w:color="auto" w:fill="1F1F1F"/>
+              <w:spacing w:line="285" w:lineRule="atLeast"/>
+              <w:rPr>
+                <w:rFonts w:ascii="Consolas" w:eastAsia="Times New Roman" w:hAnsi="Consolas" w:cs="Times New Roman"/>
+                <w:color w:val="CCCCCC"/>
+                <w:sz w:val="21"/>
+                <w:szCs w:val="21"/>
+              </w:rPr>
+            </w:pPr>
+            <w:r>
+              <w:rPr>
+                <w:rFonts w:ascii="Consolas" w:eastAsia="Times New Roman" w:hAnsi="Consolas" w:cs="Times New Roman"/>
+                <w:color w:val="CCCCCC"/>
+                <w:sz w:val="21"/>
+                <w:szCs w:val="21"/>
+              </w:rPr>
+              <w:t xml:space="preserve">    </w:t>
+            </w:r>
+            <w:r>
+              <w:rPr>
+                <w:rFonts w:ascii="Consolas" w:eastAsia="Times New Roman" w:hAnsi="Consolas" w:cs="Times New Roman"/>
+                <w:color w:val="C586C0"/>
+                <w:sz w:val="21"/>
+                <w:szCs w:val="21"/>
+              </w:rPr>
+              <w:t>return</w:t>
+            </w:r>
+            <w:r>
+              <w:rPr>
+                <w:rFonts w:ascii="Consolas" w:eastAsia="Times New Roman" w:hAnsi="Consolas" w:cs="Times New Roman"/>
+                <w:color w:val="CCCCCC"/>
+                <w:sz w:val="21"/>
+                <w:szCs w:val="21"/>
+              </w:rPr>
+              <w:t xml:space="preserve"> {</w:t>
+            </w:r>
+            <w:r>
+              <w:rPr>
+                <w:rFonts w:ascii="Consolas" w:eastAsia="Times New Roman" w:hAnsi="Consolas" w:cs="Times New Roman"/>
+                <w:color w:val="CE9178"/>
+                <w:sz w:val="21"/>
+                <w:szCs w:val="21"/>
+              </w:rPr>
+              <w:t>"message"</w:t>
+            </w:r>
+            <w:r>
+              <w:rPr>
+                <w:rFonts w:ascii="Consolas" w:eastAsia="Times New Roman" w:hAnsi="Consolas" w:cs="Times New Roman"/>
+                <w:color w:val="CCCCCC"/>
+                <w:sz w:val="21"/>
+                <w:szCs w:val="21"/>
+              </w:rPr>
+              <w:t xml:space="preserve">: </w:t>
+            </w:r>
+            <w:r>
+              <w:rPr>
+                <w:rFonts w:ascii="Consolas" w:eastAsia="Times New Roman" w:hAnsi="Consolas" w:cs="Times New Roman"/>
+                <w:color w:val="CE9178"/>
+                <w:sz w:val="21"/>
+                <w:szCs w:val="21"/>
+              </w:rPr>
+              <w:t xml:space="preserve">"Hi, </w:t>
+            </w:r>
+            <w:proofErr w:type="spellStart"/>
+            <w:r>
+              <w:rPr>
+                <w:rFonts w:ascii="Consolas" w:eastAsia="Times New Roman" w:hAnsi="Consolas" w:cs="Times New Roman"/>
+                <w:color w:val="CE9178"/>
+                <w:sz w:val="21"/>
+                <w:szCs w:val="21"/>
+              </w:rPr>
+              <w:t>i</w:t>
+            </w:r>
+            <w:proofErr w:type="spellEnd"/>
+            <w:r>
+              <w:rPr>
+                <w:rFonts w:ascii="Consolas" w:eastAsia="Times New Roman" w:hAnsi="Consolas" w:cs="Times New Roman"/>
+                <w:color w:val="CE9178"/>
+                <w:sz w:val="21"/>
+                <w:szCs w:val="21"/>
+              </w:rPr>
+              <w:t xml:space="preserve"> am learning </w:t>
+            </w:r>
+            <w:proofErr w:type="spellStart"/>
+            <w:r>
+              <w:rPr>
+                <w:rFonts w:ascii="Consolas" w:eastAsia="Times New Roman" w:hAnsi="Consolas" w:cs="Times New Roman"/>
+                <w:color w:val="CE9178"/>
+                <w:sz w:val="21"/>
+                <w:szCs w:val="21"/>
+              </w:rPr>
+              <w:t>fastapi</w:t>
+            </w:r>
+            <w:proofErr w:type="spellEnd"/>
+            <w:r>
+              <w:rPr>
+                <w:rFonts w:ascii="Consolas" w:eastAsia="Times New Roman" w:hAnsi="Consolas" w:cs="Times New Roman"/>
+                <w:color w:val="CE9178"/>
+                <w:sz w:val="21"/>
+                <w:szCs w:val="21"/>
+              </w:rPr>
+              <w:t>"</w:t>
+            </w:r>
+            <w:r>
+              <w:rPr>
+                <w:rFonts w:ascii="Consolas" w:eastAsia="Times New Roman" w:hAnsi="Consolas" w:cs="Times New Roman"/>
+                <w:color w:val="CCCCCC"/>
+                <w:sz w:val="21"/>
+                <w:szCs w:val="21"/>
+              </w:rPr>
+              <w:t>}</w:t>
+            </w:r>
+          </w:p>
+          <w:p>
+            <w:pPr>
+              <w:shd w:val="clear" w:color="auto" w:fill="1F1F1F"/>
+              <w:spacing w:line="285" w:lineRule="atLeast"/>
+              <w:rPr>
+                <w:rFonts w:ascii="Consolas" w:eastAsia="Times New Roman" w:hAnsi="Consolas" w:cs="Times New Roman"/>
+                <w:color w:val="CCCCCC"/>
+                <w:sz w:val="21"/>
+                <w:szCs w:val="21"/>
+              </w:rPr>
+            </w:pPr>
+          </w:p>
+          <w:p>
+            <w:pPr>
+              <w:shd w:val="clear" w:color="auto" w:fill="1F1F1F"/>
+              <w:spacing w:line="285" w:lineRule="atLeast"/>
+              <w:rPr>
+                <w:rFonts w:ascii="Consolas" w:eastAsia="Times New Roman" w:hAnsi="Consolas" w:cs="Times New Roman"/>
+                <w:color w:val="CCCCCC"/>
+                <w:sz w:val="21"/>
+                <w:szCs w:val="21"/>
+              </w:rPr>
+            </w:pPr>
+            <w:r>
+              <w:rPr>
+                <w:rFonts w:ascii="Consolas" w:eastAsia="Times New Roman" w:hAnsi="Consolas" w:cs="Times New Roman"/>
+                <w:color w:val="569CD6"/>
+                <w:sz w:val="21"/>
+                <w:szCs w:val="21"/>
+              </w:rPr>
+              <w:t>def</w:t>
+            </w:r>
+            <w:r>
+              <w:rPr>
+                <w:rFonts w:ascii="Consolas" w:eastAsia="Times New Roman" w:hAnsi="Consolas" w:cs="Times New Roman"/>
+                <w:color w:val="CCCCCC"/>
+                <w:sz w:val="21"/>
+                <w:szCs w:val="21"/>
+              </w:rPr>
+              <w:t xml:space="preserve"> </w:t>
+            </w:r>
+            <w:proofErr w:type="spellStart"/>
+            <w:r>
+              <w:rPr>
+                <w:rFonts w:ascii="Consolas" w:eastAsia="Times New Roman" w:hAnsi="Consolas" w:cs="Times New Roman"/>
+                <w:color w:val="DCDCAA"/>
+                <w:sz w:val="21"/>
+                <w:szCs w:val="21"/>
+              </w:rPr>
+              <w:t>load_</w:t>
+            </w:r>
+            <w:proofErr w:type="gramStart"/>
+            <w:r>
+              <w:rPr>
+                <w:rFonts w:ascii="Consolas" w:eastAsia="Times New Roman" w:hAnsi="Consolas" w:cs="Times New Roman"/>
+                <w:color w:val="DCDCAA"/>
+                <w:sz w:val="21"/>
+                <w:szCs w:val="21"/>
+              </w:rPr>
+              <w:t>data</w:t>
+            </w:r>
+            <w:proofErr w:type="spellEnd"/>
+            <w:r>
+              <w:rPr>
+                <w:rFonts w:ascii="Consolas" w:eastAsia="Times New Roman" w:hAnsi="Consolas" w:cs="Times New Roman"/>
+                <w:color w:val="CCCCCC"/>
+                <w:sz w:val="21"/>
+                <w:szCs w:val="21"/>
+              </w:rPr>
+              <w:t>(</w:t>
+            </w:r>
+            <w:proofErr w:type="gramEnd"/>
+            <w:r>
+              <w:rPr>
+                <w:rFonts w:ascii="Consolas" w:eastAsia="Times New Roman" w:hAnsi="Consolas" w:cs="Times New Roman"/>
+                <w:color w:val="CCCCCC"/>
+                <w:sz w:val="21"/>
+                <w:szCs w:val="21"/>
+              </w:rPr>
+              <w:t>):</w:t>
+            </w:r>
+          </w:p>
+          <w:p>
+            <w:pPr>
+              <w:shd w:val="clear" w:color="auto" w:fill="1F1F1F"/>
+              <w:spacing w:line="285" w:lineRule="atLeast"/>
+              <w:rPr>
+                <w:rFonts w:ascii="Consolas" w:eastAsia="Times New Roman" w:hAnsi="Consolas" w:cs="Times New Roman"/>
+                <w:color w:val="CCCCCC"/>
+                <w:sz w:val="21"/>
+                <w:szCs w:val="21"/>
+              </w:rPr>
+            </w:pPr>
+            <w:r>
+              <w:rPr>
+                <w:rFonts w:ascii="Consolas" w:eastAsia="Times New Roman" w:hAnsi="Consolas" w:cs="Times New Roman"/>
+                <w:color w:val="CCCCCC"/>
+                <w:sz w:val="21"/>
+                <w:szCs w:val="21"/>
+              </w:rPr>
+              <w:t xml:space="preserve">    </w:t>
+            </w:r>
+            <w:r>
+              <w:rPr>
+                <w:rFonts w:ascii="Consolas" w:eastAsia="Times New Roman" w:hAnsi="Consolas" w:cs="Times New Roman"/>
+                <w:color w:val="C586C0"/>
+                <w:sz w:val="21"/>
+                <w:szCs w:val="21"/>
+              </w:rPr>
+              <w:t>with</w:t>
+            </w:r>
+            <w:r>
+              <w:rPr>
+                <w:rFonts w:ascii="Consolas" w:eastAsia="Times New Roman" w:hAnsi="Consolas" w:cs="Times New Roman"/>
+                <w:color w:val="CCCCCC"/>
+                <w:sz w:val="21"/>
+                <w:szCs w:val="21"/>
+              </w:rPr>
+              <w:t xml:space="preserve"> </w:t>
+            </w:r>
+            <w:proofErr w:type="gramStart"/>
+            <w:r>
+              <w:rPr>
+                <w:rFonts w:ascii="Consolas" w:eastAsia="Times New Roman" w:hAnsi="Consolas" w:cs="Times New Roman"/>
+                <w:color w:val="DCDCAA"/>
+                <w:sz w:val="21"/>
+                <w:szCs w:val="21"/>
+              </w:rPr>
+              <w:t>open</w:t>
+            </w:r>
+            <w:r>
+              <w:rPr>
+                <w:rFonts w:ascii="Consolas" w:eastAsia="Times New Roman" w:hAnsi="Consolas" w:cs="Times New Roman"/>
+                <w:color w:val="CCCCCC"/>
+                <w:sz w:val="21"/>
+                <w:szCs w:val="21"/>
+              </w:rPr>
+              <w:t>(</w:t>
+            </w:r>
+            <w:proofErr w:type="gramEnd"/>
+            <w:r>
+              <w:rPr>
+                <w:rFonts w:ascii="Consolas" w:eastAsia="Times New Roman" w:hAnsi="Consolas" w:cs="Times New Roman"/>
+                <w:color w:val="CE9178"/>
+                <w:sz w:val="21"/>
+                <w:szCs w:val="21"/>
+              </w:rPr>
+              <w:t>'</w:t>
+            </w:r>
+            <w:proofErr w:type="spellStart"/>
+            <w:r>
+              <w:rPr>
+                <w:rFonts w:ascii="Consolas" w:eastAsia="Times New Roman" w:hAnsi="Consolas" w:cs="Times New Roman"/>
+                <w:color w:val="CE9178"/>
+                <w:sz w:val="21"/>
+                <w:szCs w:val="21"/>
+              </w:rPr>
+              <w:t>patients.json</w:t>
+            </w:r>
+            <w:proofErr w:type="spellEnd"/>
+            <w:r>
+              <w:rPr>
+                <w:rFonts w:ascii="Consolas" w:eastAsia="Times New Roman" w:hAnsi="Consolas" w:cs="Times New Roman"/>
+                <w:color w:val="CE9178"/>
+                <w:sz w:val="21"/>
+                <w:szCs w:val="21"/>
+              </w:rPr>
+              <w:t>'</w:t>
+            </w:r>
+            <w:r>
+              <w:rPr>
+                <w:rFonts w:ascii="Consolas" w:eastAsia="Times New Roman" w:hAnsi="Consolas" w:cs="Times New Roman"/>
+                <w:color w:val="CCCCCC"/>
+                <w:sz w:val="21"/>
+                <w:szCs w:val="21"/>
+              </w:rPr>
+              <w:t xml:space="preserve">, </w:t>
+            </w:r>
+            <w:r>
+              <w:rPr>
+                <w:rFonts w:ascii="Consolas" w:eastAsia="Times New Roman" w:hAnsi="Consolas" w:cs="Times New Roman"/>
+                <w:color w:val="CE9178"/>
+                <w:sz w:val="21"/>
+                <w:szCs w:val="21"/>
+              </w:rPr>
+              <w:t>'r'</w:t>
+            </w:r>
+            <w:r>
+              <w:rPr>
+                <w:rFonts w:ascii="Consolas" w:eastAsia="Times New Roman" w:hAnsi="Consolas" w:cs="Times New Roman"/>
+                <w:color w:val="CCCCCC"/>
+                <w:sz w:val="21"/>
+                <w:szCs w:val="21"/>
+              </w:rPr>
+              <w:t xml:space="preserve">) </w:t>
+            </w:r>
+            <w:r>
+              <w:rPr>
+                <w:rFonts w:ascii="Consolas" w:eastAsia="Times New Roman" w:hAnsi="Consolas" w:cs="Times New Roman"/>
+                <w:color w:val="C586C0"/>
+                <w:sz w:val="21"/>
+                <w:szCs w:val="21"/>
+              </w:rPr>
+              <w:t>as</w:t>
+            </w:r>
+            <w:r>
+              <w:rPr>
+                <w:rFonts w:ascii="Consolas" w:eastAsia="Times New Roman" w:hAnsi="Consolas" w:cs="Times New Roman"/>
+                <w:color w:val="CCCCCC"/>
+                <w:sz w:val="21"/>
+                <w:szCs w:val="21"/>
+              </w:rPr>
+              <w:t xml:space="preserve"> </w:t>
+            </w:r>
+            <w:r>
+              <w:rPr>
+                <w:rFonts w:ascii="Consolas" w:eastAsia="Times New Roman" w:hAnsi="Consolas" w:cs="Times New Roman"/>
+                <w:color w:val="9CDCFE"/>
+                <w:sz w:val="21"/>
+                <w:szCs w:val="21"/>
+              </w:rPr>
+              <w:t>f</w:t>
+            </w:r>
+            <w:r>
+              <w:rPr>
+                <w:rFonts w:ascii="Consolas" w:eastAsia="Times New Roman" w:hAnsi="Consolas" w:cs="Times New Roman"/>
+                <w:color w:val="CCCCCC"/>
+                <w:sz w:val="21"/>
+                <w:szCs w:val="21"/>
+              </w:rPr>
+              <w:t>:</w:t>
+            </w:r>
+          </w:p>
+          <w:p>
+            <w:pPr>
+              <w:shd w:val="clear" w:color="auto" w:fill="1F1F1F"/>
+              <w:spacing w:line="285" w:lineRule="atLeast"/>
+              <w:rPr>
+                <w:rFonts w:ascii="Consolas" w:eastAsia="Times New Roman" w:hAnsi="Consolas" w:cs="Times New Roman"/>
+                <w:color w:val="CCCCCC"/>
+                <w:sz w:val="21"/>
+                <w:szCs w:val="21"/>
+              </w:rPr>
+            </w:pPr>
+            <w:r>
+              <w:rPr>
+                <w:rFonts w:ascii="Consolas" w:eastAsia="Times New Roman" w:hAnsi="Consolas" w:cs="Times New Roman"/>
+                <w:color w:val="CCCCCC"/>
+                <w:sz w:val="21"/>
+                <w:szCs w:val="21"/>
+              </w:rPr>
+              <w:t xml:space="preserve">        </w:t>
+            </w:r>
+            <w:r>
+              <w:rPr>
+                <w:rFonts w:ascii="Consolas" w:eastAsia="Times New Roman" w:hAnsi="Consolas" w:cs="Times New Roman"/>
+                <w:color w:val="9CDCFE"/>
+                <w:sz w:val="21"/>
+                <w:szCs w:val="21"/>
+              </w:rPr>
+              <w:t>data</w:t>
+            </w:r>
+            <w:r>
+              <w:rPr>
+                <w:rFonts w:ascii="Consolas" w:eastAsia="Times New Roman" w:hAnsi="Consolas" w:cs="Times New Roman"/>
+                <w:color w:val="CCCCCC"/>
+                <w:sz w:val="21"/>
+                <w:szCs w:val="21"/>
+              </w:rPr>
+              <w:t xml:space="preserve"> </w:t>
+            </w:r>
+            <w:r>
+              <w:rPr>
+                <w:rFonts w:ascii="Consolas" w:eastAsia="Times New Roman" w:hAnsi="Consolas" w:cs="Times New Roman"/>
+                <w:color w:val="D4D4D4"/>
+                <w:sz w:val="21"/>
+                <w:szCs w:val="21"/>
+              </w:rPr>
+              <w:t>=</w:t>
+            </w:r>
+            <w:r>
+              <w:rPr>
+                <w:rFonts w:ascii="Consolas" w:eastAsia="Times New Roman" w:hAnsi="Consolas" w:cs="Times New Roman"/>
+                <w:color w:val="CCCCCC"/>
+                <w:sz w:val="21"/>
+                <w:szCs w:val="21"/>
+              </w:rPr>
+              <w:t xml:space="preserve"> </w:t>
+            </w:r>
+            <w:proofErr w:type="spellStart"/>
+            <w:proofErr w:type="gramStart"/>
+            <w:r>
+              <w:rPr>
+                <w:rFonts w:ascii="Consolas" w:eastAsia="Times New Roman" w:hAnsi="Consolas" w:cs="Times New Roman"/>
+                <w:color w:val="4EC9B0"/>
+                <w:sz w:val="21"/>
+                <w:szCs w:val="21"/>
+              </w:rPr>
+              <w:t>json</w:t>
+            </w:r>
+            <w:r>
+              <w:rPr>
+                <w:rFonts w:ascii="Consolas" w:eastAsia="Times New Roman" w:hAnsi="Consolas" w:cs="Times New Roman"/>
+                <w:color w:val="CCCCCC"/>
+                <w:sz w:val="21"/>
+                <w:szCs w:val="21"/>
+              </w:rPr>
+              <w:t>.</w:t>
+            </w:r>
+            <w:r>
+              <w:rPr>
+                <w:rFonts w:ascii="Consolas" w:eastAsia="Times New Roman" w:hAnsi="Consolas" w:cs="Times New Roman"/>
+                <w:color w:val="DCDCAA"/>
+                <w:sz w:val="21"/>
+                <w:szCs w:val="21"/>
+              </w:rPr>
+              <w:t>load</w:t>
+            </w:r>
+            <w:proofErr w:type="spellEnd"/>
+            <w:proofErr w:type="gramEnd"/>
+            <w:r>
+              <w:rPr>
+                <w:rFonts w:ascii="Consolas" w:eastAsia="Times New Roman" w:hAnsi="Consolas" w:cs="Times New Roman"/>
+                <w:color w:val="CCCCCC"/>
+                <w:sz w:val="21"/>
+                <w:szCs w:val="21"/>
+              </w:rPr>
+              <w:t>(</w:t>
+            </w:r>
+            <w:r>
+              <w:rPr>
+                <w:rFonts w:ascii="Consolas" w:eastAsia="Times New Roman" w:hAnsi="Consolas" w:cs="Times New Roman"/>
+                <w:color w:val="9CDCFE"/>
+                <w:sz w:val="21"/>
+                <w:szCs w:val="21"/>
+              </w:rPr>
+              <w:t>f</w:t>
+            </w:r>
+            <w:r>
+              <w:rPr>
+                <w:rFonts w:ascii="Consolas" w:eastAsia="Times New Roman" w:hAnsi="Consolas" w:cs="Times New Roman"/>
+                <w:color w:val="CCCCCC"/>
+                <w:sz w:val="21"/>
+                <w:szCs w:val="21"/>
+              </w:rPr>
+              <w:t>)</w:t>
+            </w:r>
+          </w:p>
+          <w:p>
+            <w:pPr>
+              <w:shd w:val="clear" w:color="auto" w:fill="1F1F1F"/>
+              <w:spacing w:line="285" w:lineRule="atLeast"/>
+              <w:rPr>
+                <w:rFonts w:ascii="Consolas" w:eastAsia="Times New Roman" w:hAnsi="Consolas" w:cs="Times New Roman"/>
+                <w:color w:val="CCCCCC"/>
+                <w:sz w:val="21"/>
+                <w:szCs w:val="21"/>
+              </w:rPr>
+            </w:pPr>
+            <w:r>
+              <w:rPr>
+                <w:rFonts w:ascii="Consolas" w:eastAsia="Times New Roman" w:hAnsi="Consolas" w:cs="Times New Roman"/>
+                <w:color w:val="CCCCCC"/>
+                <w:sz w:val="21"/>
+                <w:szCs w:val="21"/>
+              </w:rPr>
+              <w:t xml:space="preserve">    </w:t>
+            </w:r>
+            <w:r>
+              <w:rPr>
+                <w:rFonts w:ascii="Consolas" w:eastAsia="Times New Roman" w:hAnsi="Consolas" w:cs="Times New Roman"/>
+                <w:color w:val="C586C0"/>
+                <w:sz w:val="21"/>
+                <w:szCs w:val="21"/>
+              </w:rPr>
+              <w:t>return</w:t>
+            </w:r>
+            <w:r>
+              <w:rPr>
+                <w:rFonts w:ascii="Consolas" w:eastAsia="Times New Roman" w:hAnsi="Consolas" w:cs="Times New Roman"/>
+                <w:color w:val="CCCCCC"/>
+                <w:sz w:val="21"/>
+                <w:szCs w:val="21"/>
+              </w:rPr>
+              <w:t xml:space="preserve"> </w:t>
+            </w:r>
+            <w:r>
+              <w:rPr>
+                <w:rFonts w:ascii="Consolas" w:eastAsia="Times New Roman" w:hAnsi="Consolas" w:cs="Times New Roman"/>
+                <w:color w:val="9CDCFE"/>
+                <w:sz w:val="21"/>
+                <w:szCs w:val="21"/>
+              </w:rPr>
+              <w:t>data</w:t>
+            </w:r>
+            <w:r>
+              <w:rPr>
+                <w:rFonts w:ascii="Consolas" w:eastAsia="Times New Roman" w:hAnsi="Consolas" w:cs="Times New Roman"/>
+                <w:color w:val="CCCCCC"/>
+                <w:sz w:val="21"/>
+                <w:szCs w:val="21"/>
+              </w:rPr>
+              <w:t xml:space="preserve"> </w:t>
+            </w:r>
+            <w:r>
+              <w:rPr>
+                <w:rFonts w:ascii="Consolas" w:eastAsia="Times New Roman" w:hAnsi="Consolas" w:cs="Times New Roman"/>
+                <w:color w:val="C586C0"/>
+                <w:sz w:val="21"/>
+                <w:szCs w:val="21"/>
+              </w:rPr>
+              <w:t>if</w:t>
+            </w:r>
+            <w:r>
+              <w:rPr>
+                <w:rFonts w:ascii="Consolas" w:eastAsia="Times New Roman" w:hAnsi="Consolas" w:cs="Times New Roman"/>
+                <w:color w:val="CCCCCC"/>
+                <w:sz w:val="21"/>
+                <w:szCs w:val="21"/>
+              </w:rPr>
+              <w:t xml:space="preserve"> </w:t>
+            </w:r>
+            <w:r>
+              <w:rPr>
+                <w:rFonts w:ascii="Consolas" w:eastAsia="Times New Roman" w:hAnsi="Consolas" w:cs="Times New Roman"/>
+                <w:color w:val="9CDCFE"/>
+                <w:sz w:val="21"/>
+                <w:szCs w:val="21"/>
+              </w:rPr>
+              <w:t>data</w:t>
+            </w:r>
+            <w:r>
+              <w:rPr>
+                <w:rFonts w:ascii="Consolas" w:eastAsia="Times New Roman" w:hAnsi="Consolas" w:cs="Times New Roman"/>
+                <w:color w:val="CCCCCC"/>
+                <w:sz w:val="21"/>
+                <w:szCs w:val="21"/>
+              </w:rPr>
+              <w:t xml:space="preserve"> </w:t>
+            </w:r>
+            <w:r>
+              <w:rPr>
+                <w:rFonts w:ascii="Consolas" w:eastAsia="Times New Roman" w:hAnsi="Consolas" w:cs="Times New Roman"/>
+                <w:color w:val="C586C0"/>
+                <w:sz w:val="21"/>
+                <w:szCs w:val="21"/>
+              </w:rPr>
+              <w:t>else</w:t>
+            </w:r>
+            <w:r>
+              <w:rPr>
+                <w:rFonts w:ascii="Consolas" w:eastAsia="Times New Roman" w:hAnsi="Consolas" w:cs="Times New Roman"/>
+                <w:color w:val="CCCCCC"/>
+                <w:sz w:val="21"/>
+                <w:szCs w:val="21"/>
+              </w:rPr>
+              <w:t xml:space="preserve"> </w:t>
+            </w:r>
+            <w:r>
+              <w:rPr>
+                <w:rFonts w:ascii="Consolas" w:eastAsia="Times New Roman" w:hAnsi="Consolas" w:cs="Times New Roman"/>
+                <w:color w:val="CE9178"/>
+                <w:sz w:val="21"/>
+                <w:szCs w:val="21"/>
+              </w:rPr>
+              <w:t>"</w:t>
+            </w:r>
+            <w:r>
+              <w:rPr>
+                <w:rFonts w:ascii="Consolas" w:eastAsia="Times New Roman" w:hAnsi="Consolas" w:cs="Times New Roman"/>
+                <w:color w:val="CE9178"/>
+                <w:sz w:val="21"/>
+                <w:szCs w:val="21"/>
+              </w:rPr>
+              <w:t>not found</w:t>
+            </w:r>
+            <w:r>
+              <w:rPr>
+                <w:rFonts w:ascii="Consolas" w:eastAsia="Times New Roman" w:hAnsi="Consolas" w:cs="Times New Roman"/>
+                <w:color w:val="CE9178"/>
+                <w:sz w:val="21"/>
+                <w:szCs w:val="21"/>
+              </w:rPr>
+              <w:t>"</w:t>
+            </w:r>
+          </w:p>
+          <w:p>
+            <w:pPr>
+              <w:shd w:val="clear" w:color="auto" w:fill="1F1F1F"/>
+              <w:spacing w:line="285" w:lineRule="atLeast"/>
+              <w:rPr>
+                <w:rFonts w:ascii="Consolas" w:eastAsia="Times New Roman" w:hAnsi="Consolas" w:cs="Times New Roman"/>
+                <w:color w:val="CCCCCC"/>
+                <w:sz w:val="21"/>
+                <w:szCs w:val="21"/>
+              </w:rPr>
+            </w:pPr>
+          </w:p>
+          <w:p>
+            <w:pPr>
+              <w:shd w:val="clear" w:color="auto" w:fill="1F1F1F"/>
+              <w:spacing w:line="285" w:lineRule="atLeast"/>
+              <w:rPr>
+                <w:rFonts w:ascii="Consolas" w:eastAsia="Times New Roman" w:hAnsi="Consolas" w:cs="Times New Roman"/>
+                <w:color w:val="CCCCCC"/>
+                <w:sz w:val="21"/>
+                <w:szCs w:val="21"/>
+              </w:rPr>
+            </w:pPr>
+            <w:r>
+              <w:rPr>
+                <w:rFonts w:ascii="Consolas" w:eastAsia="Times New Roman" w:hAnsi="Consolas" w:cs="Times New Roman"/>
+                <w:color w:val="DCDCAA"/>
+                <w:sz w:val="21"/>
+                <w:szCs w:val="21"/>
+              </w:rPr>
+              <w:t>@</w:t>
+            </w:r>
+            <w:proofErr w:type="spellStart"/>
+            <w:r>
+              <w:rPr>
+                <w:rFonts w:ascii="Consolas" w:eastAsia="Times New Roman" w:hAnsi="Consolas" w:cs="Times New Roman"/>
+                <w:color w:val="9CDCFE"/>
+                <w:sz w:val="21"/>
+                <w:szCs w:val="21"/>
+              </w:rPr>
+              <w:t>app</w:t>
+            </w:r>
+            <w:r>
+              <w:rPr>
+                <w:rFonts w:ascii="Consolas" w:eastAsia="Times New Roman" w:hAnsi="Consolas" w:cs="Times New Roman"/>
+                <w:color w:val="DCDCAA"/>
+                <w:sz w:val="21"/>
+                <w:szCs w:val="21"/>
+              </w:rPr>
+              <w:t>.get</w:t>
+            </w:r>
+            <w:proofErr w:type="spellEnd"/>
+            <w:r>
+              <w:rPr>
+                <w:rFonts w:ascii="Consolas" w:eastAsia="Times New Roman" w:hAnsi="Consolas" w:cs="Times New Roman"/>
+                <w:color w:val="CCCCCC"/>
+                <w:sz w:val="21"/>
+                <w:szCs w:val="21"/>
+              </w:rPr>
+              <w:t>(</w:t>
+            </w:r>
+            <w:r>
+              <w:rPr>
+                <w:rFonts w:ascii="Consolas" w:eastAsia="Times New Roman" w:hAnsi="Consolas" w:cs="Times New Roman"/>
+                <w:color w:val="CE9178"/>
+                <w:sz w:val="21"/>
+                <w:szCs w:val="21"/>
+              </w:rPr>
+              <w:t>"/view"</w:t>
+            </w:r>
+            <w:r>
+              <w:rPr>
+                <w:rFonts w:ascii="Consolas" w:eastAsia="Times New Roman" w:hAnsi="Consolas" w:cs="Times New Roman"/>
+                <w:color w:val="CCCCCC"/>
+                <w:sz w:val="21"/>
+                <w:szCs w:val="21"/>
+              </w:rPr>
+              <w:t>)</w:t>
+            </w:r>
+          </w:p>
+          <w:p>
+            <w:pPr>
+              <w:shd w:val="clear" w:color="auto" w:fill="1F1F1F"/>
+              <w:spacing w:line="285" w:lineRule="atLeast"/>
+              <w:rPr>
+                <w:rFonts w:ascii="Consolas" w:eastAsia="Times New Roman" w:hAnsi="Consolas" w:cs="Times New Roman"/>
+                <w:color w:val="CCCCCC"/>
+                <w:sz w:val="21"/>
+                <w:szCs w:val="21"/>
+              </w:rPr>
+            </w:pPr>
+            <w:r>
+              <w:rPr>
+                <w:rFonts w:ascii="Consolas" w:eastAsia="Times New Roman" w:hAnsi="Consolas" w:cs="Times New Roman"/>
+                <w:color w:val="569CD6"/>
+                <w:sz w:val="21"/>
+                <w:szCs w:val="21"/>
+              </w:rPr>
+              <w:t>def</w:t>
+            </w:r>
+            <w:r>
+              <w:rPr>
+                <w:rFonts w:ascii="Consolas" w:eastAsia="Times New Roman" w:hAnsi="Consolas" w:cs="Times New Roman"/>
+                <w:color w:val="CCCCCC"/>
+                <w:sz w:val="21"/>
+                <w:szCs w:val="21"/>
+              </w:rPr>
+              <w:t xml:space="preserve"> </w:t>
+            </w:r>
+            <w:proofErr w:type="gramStart"/>
+            <w:r>
+              <w:rPr>
+                <w:rFonts w:ascii="Consolas" w:eastAsia="Times New Roman" w:hAnsi="Consolas" w:cs="Times New Roman"/>
+                <w:color w:val="DCDCAA"/>
+                <w:sz w:val="21"/>
+                <w:szCs w:val="21"/>
+              </w:rPr>
+              <w:t>view</w:t>
+            </w:r>
+            <w:r>
+              <w:rPr>
+                <w:rFonts w:ascii="Consolas" w:eastAsia="Times New Roman" w:hAnsi="Consolas" w:cs="Times New Roman"/>
+                <w:color w:val="CCCCCC"/>
+                <w:sz w:val="21"/>
+                <w:szCs w:val="21"/>
+              </w:rPr>
+              <w:t>(</w:t>
+            </w:r>
+            <w:proofErr w:type="gramEnd"/>
+            <w:r>
+              <w:rPr>
+                <w:rFonts w:ascii="Consolas" w:eastAsia="Times New Roman" w:hAnsi="Consolas" w:cs="Times New Roman"/>
+                <w:color w:val="CCCCCC"/>
+                <w:sz w:val="21"/>
+                <w:szCs w:val="21"/>
+              </w:rPr>
+              <w:t>):</w:t>
+            </w:r>
+          </w:p>
+          <w:p>
+            <w:pPr>
+              <w:shd w:val="clear" w:color="auto" w:fill="1F1F1F"/>
+              <w:spacing w:line="285" w:lineRule="atLeast"/>
+              <w:rPr>
+                <w:rFonts w:ascii="Consolas" w:eastAsia="Times New Roman" w:hAnsi="Consolas" w:cs="Times New Roman"/>
+                <w:color w:val="CCCCCC"/>
+                <w:sz w:val="21"/>
+                <w:szCs w:val="21"/>
+              </w:rPr>
+            </w:pPr>
+            <w:r>
+              <w:rPr>
+                <w:rFonts w:ascii="Consolas" w:eastAsia="Times New Roman" w:hAnsi="Consolas" w:cs="Times New Roman"/>
+                <w:color w:val="CCCCCC"/>
+                <w:sz w:val="21"/>
+                <w:szCs w:val="21"/>
+              </w:rPr>
+              <w:t xml:space="preserve">    </w:t>
+            </w:r>
+            <w:r>
+              <w:rPr>
+                <w:rFonts w:ascii="Consolas" w:eastAsia="Times New Roman" w:hAnsi="Consolas" w:cs="Times New Roman"/>
+                <w:color w:val="C586C0"/>
+                <w:sz w:val="21"/>
+                <w:szCs w:val="21"/>
+              </w:rPr>
+              <w:t>return</w:t>
+            </w:r>
+            <w:r>
+              <w:rPr>
+                <w:rFonts w:ascii="Consolas" w:eastAsia="Times New Roman" w:hAnsi="Consolas" w:cs="Times New Roman"/>
+                <w:color w:val="CCCCCC"/>
+                <w:sz w:val="21"/>
+                <w:szCs w:val="21"/>
+              </w:rPr>
+              <w:t xml:space="preserve"> </w:t>
+            </w:r>
+            <w:proofErr w:type="spellStart"/>
+            <w:r>
+              <w:rPr>
+                <w:rFonts w:ascii="Consolas" w:eastAsia="Times New Roman" w:hAnsi="Consolas" w:cs="Times New Roman"/>
+                <w:color w:val="DCDCAA"/>
+                <w:sz w:val="21"/>
+                <w:szCs w:val="21"/>
+              </w:rPr>
+              <w:t>load_</w:t>
+            </w:r>
+            <w:proofErr w:type="gramStart"/>
+            <w:r>
+              <w:rPr>
+                <w:rFonts w:ascii="Consolas" w:eastAsia="Times New Roman" w:hAnsi="Consolas" w:cs="Times New Roman"/>
+                <w:color w:val="DCDCAA"/>
+                <w:sz w:val="21"/>
+                <w:szCs w:val="21"/>
+              </w:rPr>
+              <w:t>data</w:t>
+            </w:r>
+            <w:proofErr w:type="spellEnd"/>
+            <w:r>
+              <w:rPr>
+                <w:rFonts w:ascii="Consolas" w:eastAsia="Times New Roman" w:hAnsi="Consolas" w:cs="Times New Roman"/>
+                <w:color w:val="CCCCCC"/>
+                <w:sz w:val="21"/>
+                <w:szCs w:val="21"/>
+              </w:rPr>
+              <w:t>(</w:t>
+            </w:r>
+            <w:proofErr w:type="gramEnd"/>
+            <w:r>
+              <w:rPr>
+                <w:rFonts w:ascii="Consolas" w:eastAsia="Times New Roman" w:hAnsi="Consolas" w:cs="Times New Roman"/>
+                <w:color w:val="CCCCCC"/>
+                <w:sz w:val="21"/>
+                <w:szCs w:val="21"/>
+              </w:rPr>
+              <w:t>)</w:t>
+            </w:r>
+          </w:p>
+          <w:p>
+            <w:pPr>
+              <w:shd w:val="clear" w:color="auto" w:fill="1F1F1F"/>
+              <w:spacing w:line="285" w:lineRule="atLeast"/>
+              <w:rPr>
+                <w:rFonts w:ascii="Consolas" w:eastAsia="Times New Roman" w:hAnsi="Consolas" w:cs="Times New Roman"/>
+                <w:color w:val="CCCCCC"/>
+                <w:sz w:val="21"/>
+                <w:szCs w:val="21"/>
+              </w:rPr>
+            </w:pPr>
+          </w:p>
+          <w:p>
+            <w:pPr>
+              <w:pStyle w:val="NoSpacing"/>
+              <w:rPr>
+                <w:rFonts w:ascii="Poppins" w:hAnsi="Poppins" w:cs="Poppins"/>
+                <w:sz w:val="28"/>
+              </w:rPr>
+            </w:pPr>
+          </w:p>
+        </w:tc>
+      </w:tr>
+    </w:tbl>
+    <w:p>
+      <w:pPr>
+        <w:pStyle w:val="NoSpacing"/>
+        <w:rPr>
+          <w:rFonts w:ascii="Poppins" w:hAnsi="Poppins" w:cs="Poppins"/>
+          <w:sz w:val="28"/>
+        </w:rPr>
+      </w:pPr>
+    </w:p>
+    <w:tbl>
+      <w:tblPr>
+        <w:tblStyle w:val="TableGrid"/>
+        <w:tblW w:w="0" w:type="auto"/>
+        <w:tblLook w:val="04A0" w:firstRow="1" w:lastRow="0" w:firstColumn="1" w:lastColumn="0" w:noHBand="0" w:noVBand="1"/>
+      </w:tblPr>
+      <w:tblGrid>
+        <w:gridCol w:w="9350"/>
+      </w:tblGrid>
+      <w:tr>
+        <w:tc>
+          <w:tcPr>
+            <w:tcW w:w="9350" w:type="dxa"/>
+          </w:tcPr>
+          <w:p>
+            <w:pPr>
+              <w:pStyle w:val="NoSpacing"/>
+              <w:rPr>
+                <w:rFonts w:ascii="Poppins" w:hAnsi="Poppins" w:cs="Poppins"/>
+                <w:sz w:val="28"/>
+              </w:rPr>
+            </w:pPr>
+            <w:r>
+              <w:rPr>
+                <w:rFonts w:ascii="Poppins" w:hAnsi="Poppins" w:cs="Poppins"/>
+                <w:sz w:val="28"/>
+              </w:rPr>
+              <w:t>http://127.0.0.1:8000/docs</w:t>
+            </w:r>
+            <w:bookmarkStart w:id="0" w:name="_GoBack"/>
+            <w:bookmarkEnd w:id="0"/>
+          </w:p>
+        </w:tc>
+      </w:tr>
+    </w:tbl>
+    <w:p>
+      <w:pPr>
+        <w:pStyle w:val="NoSpacing"/>
+        <w:rPr>
+          <w:rFonts w:ascii="Poppins" w:hAnsi="Poppins" w:cs="Poppins"/>
+          <w:sz w:val="28"/>
+        </w:rPr>
+      </w:pPr>
+      <w:r>
+        <w:rPr>
+          <w:rFonts w:ascii="Poppins" w:hAnsi="Poppins" w:cs="Poppins"/>
+          <w:sz w:val="28"/>
+        </w:rPr>
+        <w:lastRenderedPageBreak/>
+        <w:drawing>
+          <wp:inline distT="0" distB="0" distL="0" distR="0" wp14:anchorId="175C7F47" wp14:editId="56D58D6F">
+            <wp:extent cx="5943600" cy="2842260"/>
+            <wp:effectExtent l="0" t="0" r="0" b="0"/>
+            <wp:docPr id="1" name="Picture 1"/>
+            <wp:cNvGraphicFramePr>
+              <a:graphicFrameLocks xmlns:a="http://schemas.openxmlformats.org/drawingml/2006/main" noChangeAspect="1"/>
+            </wp:cNvGraphicFramePr>
+            <a:graphic xmlns:a="http://schemas.openxmlformats.org/drawingml/2006/main">
+              <a:graphicData uri="http://schemas.openxmlformats.org/drawingml/2006/picture">
+                <pic:pic xmlns:pic="http://schemas.openxmlformats.org/drawingml/2006/picture">
+                  <pic:nvPicPr>
+                    <pic:cNvPr id="1" name=""/>
+                    <pic:cNvPicPr/>
+                  </pic:nvPicPr>
+                  <pic:blipFill>
+                    <a:blip r:embed="rId4"/>
+                    <a:stretch>
+                      <a:fillRect/>
+                    </a:stretch>
+                  </pic:blipFill>
+                  <pic:spPr>
+                    <a:xfrm>
+                      <a:off x="0" y="0"/>
+                      <a:ext cx="5943600" cy="2842260"/>
+                    </a:xfrm>
+                    <a:prstGeom prst="rect">
+                      <a:avLst/>
+                    </a:prstGeom>
+                  </pic:spPr>
+                </pic:pic>
+              </a:graphicData>
+            </a:graphic>
+          </wp:inline>
+        </w:drawing>
+      </w:r>
+    </w:p>
+    <w:p>
+      <w:pPr>
+        <w:pStyle w:val="NoSpacing"/>
+        <w:rPr>
+          <w:rFonts w:ascii="Poppins" w:hAnsi="Poppins" w:cs="Poppins"/>
+          <w:sz w:val="28"/>
+        </w:rPr>
+      </w:pPr>
     </w:p>
     <w:sectPr>
       <w:pgSz w:w="12240" w:h="15840"/>
@@ -555,6 +2108,25 @@
       <w:spacing w:after="0" w:line="240" w:lineRule="auto"/>
     </w:pPr>
   </w:style>
+  <w:style w:type="table" w:styleId="TableGrid">
+    <w:name w:val="Table Grid"/>
+    <w:basedOn w:val="TableNormal"/>
+    <w:uiPriority w:val="39"/>
+    <w:rsid w:val="00D04F89"/>
+    <w:pPr>
+      <w:spacing w:after="0" w:line="240" w:lineRule="auto"/>
+    </w:pPr>
+    <w:tblPr>
+      <w:tblBorders>
+        <w:top w:val="single" w:sz="4" w:space="0" w:color="auto"/>
+        <w:left w:val="single" w:sz="4" w:space="0" w:color="auto"/>
+        <w:bottom w:val="single" w:sz="4" w:space="0" w:color="auto"/>
+        <w:right w:val="single" w:sz="4" w:space="0" w:color="auto"/>
+        <w:insideH w:val="single" w:sz="4" w:space="0" w:color="auto"/>
+        <w:insideV w:val="single" w:sz="4" w:space="0" w:color="auto"/>
+      </w:tblBorders>
+    </w:tblPr>
+  </w:style>
 </w:styles>
 </file>
 

</xml_diff>